<commit_message>
Apply review fixes to Tosca MCP training materials and add verification report
- Correct module claim: MCP cannot scan screens for UI modules, but
  can create API modules
- Lab 2: change TestCaseWorkState via set_attribute to avoid a
  blocking dialog; extend T00 rule and troubleshooting
- Lab 3: reference the password through a TCP instead of typing it
  into the prompt
- Lab 4: save before each validation run
- Clarify that Tricentis ships the 18 workflow templates and the
  prompt templates were written for this course
- Move the break after Lab 3, fix multi-user save order and
  Unknown task guidance, add instructor prep checklist
- Make the deck builder write theme colors itself; add package.json

Co-Authored-By: Claude Opus 5.5 <noreply@anthropic.com>
Claude-Session: https://claude.ai/code/session_01626LBpPfoWb6LeDmH9KQxD
</commit_message>
<xml_diff>
--- a/tosca-mcp-training/Tosca_Commander_MCP_실습워크북.docx
+++ b/tosca-mcp-training/Tosca_Commander_MCP_실습워크북.docx
@@ -1959,6 +1959,22 @@
         <w:rPr>
           <w:rFonts w:ascii="맑은 고딕" w:cs="맑은 고딕" w:eastAsia="맑은 고딕" w:hAnsi="맑은 고딕"/>
         </w:rPr>
+        <w:t xml:space="preserve">실습은 Lab 0부터 Lab 5까지 한 대화창에서 이어서 진행합니다. 대화를 새로 열면 AI가 앞에서 한 작업을 기억하지 못합니다.</w:t>
+      </w:r>
+    </w:p>
+    <w:p>
+      <w:pPr>
+        <w:pStyle w:val="ListParagraph"/>
+        <w:numPr>
+          <w:ilvl w:val="0"/>
+          <w:numId w:val="2"/>
+        </w:numPr>
+        <w:spacing w:after="60" w:line="290"/>
+      </w:pPr>
+      <w:r>
+        <w:rPr>
+          <w:rFonts w:ascii="맑은 고딕" w:cs="맑은 고딕" w:eastAsia="맑은 고딕" w:hAnsi="맑은 고딕"/>
+        </w:rPr>
         <w:t xml:space="preserve">AI 어시스턴트의 답은 매번 문구가 조금씩 다릅니다. 워크북의 화면 예시와 똑같지 않아도 확인 포인트만 맞으면 됩니다.</w:t>
       </w:r>
     </w:p>
@@ -2020,7 +2036,7 @@
         <w:rPr>
           <w:rFonts w:ascii="맑은 고딕" w:cs="맑은 고딕" w:eastAsia="맑은 고딕" w:hAnsi="맑은 고딕"/>
         </w:rPr>
-        <w:t xml:space="preserve">예전에는 AI 앱과 프로그램을 연결하려면 조합마다 연동을 따로 만들어야 했습니다. MCP는 규격이 하나이므로 AI 앱과 프로그램이 각자 MCP만 지원하면 서로 연결됩니다. 그래서 'AI용 USB-C'에 자주 비유합니다.</w:t>
+        <w:t xml:space="preserve">예전에는 AI 앱과 프로그램을 연결하려면 조합마다 연동을 따로 만들어야 했습니다. MCP는 규격이 하나이므로 AI 앱과 프로그램이 각자 MCP만 지원하면 서로 연결됩니다. Tosca 쪽은 MCP 서버 하나만 만들면 Copilot, Cursor, Claude 어디서든 쓸 수 있습니다.</w:t>
       </w:r>
     </w:p>
     <w:tbl>
@@ -2580,7 +2596,7 @@
           <w:b/>
           <w:bCs/>
         </w:rPr>
-        <w:t xml:space="preserve">2번이 핵심입니다. </w:t>
+        <w:t xml:space="preserve">2번을 눈여겨보세요. </w:t>
       </w:r>
       <w:r>
         <w:rPr>
@@ -4156,7 +4172,7 @@
         <w:rPr>
           <w:rFonts w:ascii="맑은 고딕" w:cs="맑은 고딕" w:eastAsia="맑은 고딕" w:hAnsi="맑은 고딕"/>
         </w:rPr>
-        <w:t xml:space="preserve">할 수 있는 일만큼 중요한 것이 맡기면 안 되는 일입니다. 아래 여섯 가지는 사람이 직접 하거나 반드시 사람이 확인합니다.</w:t>
+        <w:t xml:space="preserve">AI에게 맡기지 않을 일도 미리 정해 둡니다. 아래 여섯 가지는 사람이 직접 하거나 반드시 사람이 확인합니다. 참고로 API 모듈은 MCP 도구(create_api_module)로 만들 수 있고, 스캔이 필요한 UI 모듈만 사람이 만듭니다.</w:t>
       </w:r>
     </w:p>
     <w:tbl>
@@ -4317,7 +4333,7 @@
                 <w:sz w:val="18"/>
                 <w:szCs w:val="18"/>
               </w:rPr>
-              <w:t xml:space="preserve">AI는 이미 있는 모듈만 재사용한다. 새 화면은 사람이 XScan으로 스캔한다.</w:t>
+              <w:t xml:space="preserve">AI는 화면을 스캔해 UI 모듈을 만들지 못한다. 새 화면은 사람이 XScan으로 스캔한다.</w:t>
             </w:r>
           </w:p>
         </w:tc>
@@ -5135,7 +5151,26 @@
         <w:rPr>
           <w:rFonts w:ascii="맑은 고딕" w:cs="맑은 고딕" w:eastAsia="맑은 고딕" w:hAnsi="맑은 고딕"/>
         </w:rPr>
-        <w:t xml:space="preserve">  (권장) commander-mcp 스킬팩을 설치했다 (2.3 참고)</w:t>
+        <w:t xml:space="preserve">  commander-mcp 스킬팩을 설치했다 (2.3 참고)</w:t>
+      </w:r>
+    </w:p>
+    <w:p>
+      <w:pPr>
+        <w:spacing w:after="70" w:line="290"/>
+        <w:ind w:left="360" w:hanging="360"/>
+      </w:pPr>
+      <w:r>
+        <w:rPr>
+          <w:rFonts w:ascii="맑은 고딕" w:cs="맑은 고딕" w:eastAsia="맑은 고딕" w:hAnsi="맑은 고딕"/>
+          <w:color w:val="0F4C5C"/>
+        </w:rPr>
+        <w:t xml:space="preserve">☐</w:t>
+      </w:r>
+      <w:r>
+        <w:rPr>
+          <w:rFonts w:ascii="맑은 고딕" w:cs="맑은 고딕" w:eastAsia="맑은 고딕" w:hAnsi="맑은 고딕"/>
+        </w:rPr>
+        <w:t xml:space="preserve">  사내 AI 사용 정책상 워크스페이스 정보를 AI 어시스턴트로 보내도 되는지 확인했다</w:t>
       </w:r>
     </w:p>
     <w:p>
@@ -5867,7 +5902,7 @@
         <w:rPr>
           <w:rFonts w:ascii="맑은 고딕" w:cs="맑은 고딕" w:eastAsia="맑은 고딕" w:hAnsi="맑은 고딕"/>
         </w:rPr>
-        <w:t xml:space="preserve">2.3  스킬팩 설치 (권장)</w:t>
+        <w:t xml:space="preserve">2.3  스킬팩 설치</w:t>
       </w:r>
     </w:p>
     <w:p>
@@ -5878,7 +5913,7 @@
         <w:rPr>
           <w:rFonts w:ascii="맑은 고딕" w:cs="맑은 고딕" w:eastAsia="맑은 고딕" w:hAnsi="맑은 고딕"/>
         </w:rPr>
-        <w:t xml:space="preserve">Tricentis가 공개한 commander-mcp 스킬팩은 AI 어시스턴트에게 Commander MCP를 다루는 규칙과 작업 순서를 알려 줍니다. 체크아웃과 저장 순서, 대화상자를 여는 메뉴 작업 피하기, 워크플로 템플릿 18종 같은 내용이 들어 있습니다. MCP 연결과는 별개이며, Tricentis는 둘을 함께 쓰기를 권합니다.</w:t>
+        <w:t xml:space="preserve">Tricentis가 공개한 commander-mcp 스킬팩은 AI 어시스턴트에게 Commander MCP를 다루는 규칙과 작업 순서를 알려 줍니다. 체크아웃과 저장 순서, 대화상자를 여는 메뉴 작업 피하기, 워크플로 템플릿 18종 같은 내용이 들어 있습니다. MCP 연결과는 별개입니다. Tricentis 문서는 둘을 함께 쓰기를 권하고, 스킬팩 안내서는 둘 다 있어야 자동화가 된다고 설명합니다. 이 과정은 스킬팩 설치를 전제로 합니다.</w:t>
       </w:r>
     </w:p>
     <w:p>
@@ -6576,7 +6611,26 @@
         <w:rPr>
           <w:rFonts w:ascii="맑은 고딕" w:cs="맑은 고딕" w:eastAsia="맑은 고딕" w:hAnsi="맑은 고딕"/>
         </w:rPr>
-        <w:t xml:space="preserve">클라이언트에서 /commander-mcp 스킬이 보이고, Lab 0의 워크스페이스 정보 요청이 성공하면 됩니다.</w:t>
+        <w:t xml:space="preserve">Claude Code와 Cursor는 /commander-mcp 스킬이 목록에 보이는지, VS Code는 .github/instructions/commander-mcp.instructions.md 파일이 생겼는지 확인합니다. 그다음 Lab 0의 워크스페이스 정보 요청이 성공하면 됩니다.</w:t>
+      </w:r>
+    </w:p>
+    <w:p>
+      <w:pPr>
+        <w:spacing w:after="120" w:before="0" w:line="300"/>
+      </w:pPr>
+      <w:r>
+        <w:rPr>
+          <w:rFonts w:ascii="맑은 고딕" w:cs="맑은 고딕" w:eastAsia="맑은 고딕" w:hAnsi="맑은 고딕"/>
+          <w:b/>
+          <w:bCs/>
+        </w:rPr>
+        <w:t xml:space="preserve">VS Code와 Claude Desktop  </w:t>
+      </w:r>
+      <w:r>
+        <w:rPr>
+          <w:rFonts w:ascii="맑은 고딕" w:cs="맑은 고딕" w:eastAsia="맑은 고딕" w:hAnsi="맑은 고딕"/>
+        </w:rPr>
+        <w:t xml:space="preserve">VS Code에는 짧은 지침 파일만 설치되고 워크플로 문서는 들어가지 않습니다. Claude Desktop은 스킬팩 설치 안내에 없으므로 사내 Claude 관리자에게 스킬 배포 방법을 확인합니다. 두 경우 모두 5장 T00 공통 머리말을 꼭 붙여 넣어 규칙을 직접 알려 주세요.</w:t>
       </w:r>
     </w:p>
     <w:p>
@@ -7398,7 +7452,18 @@
           <w:sz w:val="19"/>
           <w:szCs w:val="19"/>
         </w:rPr>
-        <w:t xml:space="preserve">실습 계정 기록</w:t>
+        <w:t xml:space="preserve">실습 계정</w:t>
+      </w:r>
+    </w:p>
+    <w:p>
+      <w:pPr>
+        <w:spacing w:after="120" w:before="0" w:line="300"/>
+      </w:pPr>
+      <w:r>
+        <w:rPr>
+          <w:rFonts w:ascii="맑은 고딕" w:cs="맑은 고딕" w:eastAsia="맑은 고딕" w:hAnsi="맑은 고딕"/>
+        </w:rPr>
+        <w:t xml:space="preserve">이메일은 강사가 나눠 줍니다. 비밀번호는 AI에게 보내지 않도록 강사가 TestCases/MCP실습 폴더에 DWS_Password라는 TCP(Test Configuration Parameter)로 넣어 두었습니다. 프롬프트에는 비밀번호 대신 참조 {CP[DWS_Password]}만 적습니다.</w:t>
       </w:r>
     </w:p>
     <w:tbl>
@@ -7489,77 +7554,6 @@
           </w:p>
         </w:tc>
       </w:tr>
-      <w:tr>
-        <w:trPr>
-          <w:cantSplit/>
-          <w:trHeight w:val="460" w:hRule="atLeast"/>
-        </w:trPr>
-        <w:tc>
-          <w:tcPr>
-            <w:tcW w:type="dxa" w:w="3000"/>
-            <w:tcBorders>
-              <w:top w:val="single" w:color="C9D7DA" w:sz="4"/>
-              <w:left w:val="single" w:color="C9D7DA" w:sz="4"/>
-              <w:bottom w:val="single" w:color="C9D7DA" w:sz="4"/>
-              <w:right w:val="single" w:color="C9D7DA" w:sz="4"/>
-            </w:tcBorders>
-            <w:shd w:fill="EAF1F2" w:color="auto" w:val="clear"/>
-            <w:tcMar>
-              <w:top w:type="dxa" w:w="70"/>
-              <w:left w:type="dxa" w:w="110"/>
-              <w:bottom w:type="dxa" w:w="70"/>
-              <w:right w:type="dxa" w:w="110"/>
-            </w:tcMar>
-            <w:vAlign w:val="center"/>
-          </w:tcPr>
-          <w:p>
-            <w:pPr>
-              <w:spacing w:after="40" w:line="270"/>
-            </w:pPr>
-            <w:r>
-              <w:rPr>
-                <w:rFonts w:ascii="맑은 고딕" w:cs="맑은 고딕" w:eastAsia="맑은 고딕" w:hAnsi="맑은 고딕"/>
-                <w:b/>
-                <w:bCs/>
-                <w:sz w:val="18"/>
-                <w:szCs w:val="18"/>
-              </w:rPr>
-              <w:t xml:space="preserve">비밀번호 보관 방법 (적지 말 것)</w:t>
-            </w:r>
-          </w:p>
-        </w:tc>
-        <w:tc>
-          <w:tcPr>
-            <w:tcW w:type="dxa" w:w="6638"/>
-            <w:tcBorders>
-              <w:top w:val="single" w:color="C9D7DA" w:sz="4"/>
-              <w:left w:val="single" w:color="C9D7DA" w:sz="4"/>
-              <w:bottom w:val="single" w:color="C9D7DA" w:sz="4"/>
-              <w:right w:val="single" w:color="C9D7DA" w:sz="4"/>
-            </w:tcBorders>
-            <w:tcMar>
-              <w:top w:type="dxa" w:w="70"/>
-              <w:left w:type="dxa" w:w="110"/>
-              <w:bottom w:type="dxa" w:w="70"/>
-              <w:right w:type="dxa" w:w="110"/>
-            </w:tcMar>
-            <w:vAlign w:val="center"/>
-          </w:tcPr>
-          <w:p>
-            <w:pPr>
-              <w:spacing w:after="40" w:line="270"/>
-            </w:pPr>
-            <w:r>
-              <w:rPr>
-                <w:rFonts w:ascii="맑은 고딕" w:cs="맑은 고딕" w:eastAsia="맑은 고딕" w:hAnsi="맑은 고딕"/>
-                <w:sz w:val="18"/>
-                <w:szCs w:val="18"/>
-              </w:rPr>
-              <w:t xml:space="preserve"/>
-            </w:r>
-          </w:p>
-        </w:tc>
-      </w:tr>
     </w:tbl>
     <w:p>
       <w:pPr>
@@ -7581,7 +7575,7 @@
         <w:rPr>
           <w:rFonts w:ascii="맑은 고딕" w:cs="맑은 고딕" w:eastAsia="맑은 고딕" w:hAnsi="맑은 고딕"/>
         </w:rPr>
-        <w:t xml:space="preserve">Lab 0부터 순서대로 진행합니다. 앞 Lab의 결과를 뒤 Lab에서 쓰므로 건너뛰지 않습니다. 모든 프롬프트에서 [내 이름], [실습 이메일], [실습 비밀번호]는 자기 값으로 바꿉니다.</w:t>
+        <w:t xml:space="preserve">Lab 0부터 순서대로 진행합니다. 앞 Lab의 결과를 뒤 Lab에서 쓰므로 건너뛰지 않습니다. 모든 프롬프트에서 [내 이름], [실습 이메일]은 자기 값으로 바꿉니다. 비밀번호는 프롬프트에 쓰지 않습니다(2.4 참고).</w:t>
       </w:r>
     </w:p>
     <w:tbl>
@@ -8158,7 +8152,7 @@
                 <w:sz w:val="18"/>
                 <w:szCs w:val="18"/>
               </w:rPr>
-              <w:t xml:space="preserve">테스트케이스 생성</w:t>
+              <w:t xml:space="preserve">테스트케이스 생성 (만들 때 바로 저장)</w:t>
             </w:r>
           </w:p>
         </w:tc>
@@ -8299,7 +8293,7 @@
                 <w:sz w:val="18"/>
                 <w:szCs w:val="18"/>
               </w:rPr>
-              <w:t xml:space="preserve">테스트케이스 생성</w:t>
+              <w:t xml:space="preserve">테스트케이스 생성 (만들 때 바로 저장)</w:t>
             </w:r>
           </w:p>
         </w:tc>
@@ -8337,7 +8331,7 @@
                 <w:sz w:val="18"/>
                 <w:szCs w:val="18"/>
               </w:rPr>
-              <w:t xml:space="preserve">Lab 4</w:t>
+              <w:t xml:space="preserve">휴식</w:t>
             </w:r>
           </w:p>
         </w:tc>
@@ -8370,7 +8364,7 @@
                 <w:sz w:val="18"/>
                 <w:szCs w:val="18"/>
               </w:rPr>
-              <w:t xml:space="preserve">ScratchBook 검증 실행과 수정</w:t>
+              <w:t xml:space="preserve"/>
             </w:r>
           </w:p>
         </w:tc>
@@ -8403,7 +8397,7 @@
                 <w:sz w:val="18"/>
                 <w:szCs w:val="18"/>
               </w:rPr>
-              <w:t xml:space="preserve">20분</w:t>
+              <w:t xml:space="preserve">10분</w:t>
             </w:r>
           </w:p>
         </w:tc>
@@ -8436,7 +8430,7 @@
                 <w:sz w:val="18"/>
                 <w:szCs w:val="18"/>
               </w:rPr>
-              <w:t xml:space="preserve">값 수정, 실행</w:t>
+              <w:t xml:space="preserve"/>
             </w:r>
           </w:p>
         </w:tc>
@@ -8475,7 +8469,7 @@
                 <w:sz w:val="18"/>
                 <w:szCs w:val="18"/>
               </w:rPr>
-              <w:t xml:space="preserve">Lab 5</w:t>
+              <w:t xml:space="preserve">Lab 4</w:t>
             </w:r>
           </w:p>
         </w:tc>
@@ -8509,7 +8503,7 @@
                 <w:sz w:val="18"/>
                 <w:szCs w:val="18"/>
               </w:rPr>
-              <w:t xml:space="preserve">저장과 정리</w:t>
+              <w:t xml:space="preserve">ScratchBook 검증 실행과 수정</w:t>
             </w:r>
           </w:p>
         </w:tc>
@@ -8543,6 +8537,144 @@
                 <w:sz w:val="18"/>
                 <w:szCs w:val="18"/>
               </w:rPr>
+              <w:t xml:space="preserve">20분</w:t>
+            </w:r>
+          </w:p>
+        </w:tc>
+        <w:tc>
+          <w:tcPr>
+            <w:tcW w:type="dxa" w:w="2800"/>
+            <w:tcBorders>
+              <w:top w:val="single" w:color="C9D7DA" w:sz="4"/>
+              <w:left w:val="single" w:color="C9D7DA" w:sz="4"/>
+              <w:bottom w:val="single" w:color="C9D7DA" w:sz="4"/>
+              <w:right w:val="single" w:color="C9D7DA" w:sz="4"/>
+            </w:tcBorders>
+            <w:shd w:fill="EAF1F2" w:color="auto" w:val="clear"/>
+            <w:tcMar>
+              <w:top w:type="dxa" w:w="70"/>
+              <w:left w:type="dxa" w:w="110"/>
+              <w:bottom w:type="dxa" w:w="70"/>
+              <w:right w:type="dxa" w:w="110"/>
+            </w:tcMar>
+            <w:vAlign w:val="center"/>
+          </w:tcPr>
+          <w:p>
+            <w:pPr>
+              <w:spacing w:after="40" w:line="270"/>
+            </w:pPr>
+            <w:r>
+              <w:rPr>
+                <w:rFonts w:ascii="맑은 고딕" w:cs="맑은 고딕" w:eastAsia="맑은 고딕" w:hAnsi="맑은 고딕"/>
+                <w:b w:val="false"/>
+                <w:bCs w:val="false"/>
+                <w:sz w:val="18"/>
+                <w:szCs w:val="18"/>
+              </w:rPr>
+              <w:t xml:space="preserve">값 수정 (저장 필요), 실행</w:t>
+            </w:r>
+          </w:p>
+        </w:tc>
+      </w:tr>
+      <w:tr>
+        <w:trPr>
+          <w:cantSplit/>
+        </w:trPr>
+        <w:tc>
+          <w:tcPr>
+            <w:tcW w:type="dxa" w:w="1200"/>
+            <w:tcBorders>
+              <w:top w:val="single" w:color="C9D7DA" w:sz="4"/>
+              <w:left w:val="single" w:color="C9D7DA" w:sz="4"/>
+              <w:bottom w:val="single" w:color="C9D7DA" w:sz="4"/>
+              <w:right w:val="single" w:color="C9D7DA" w:sz="4"/>
+            </w:tcBorders>
+            <w:tcMar>
+              <w:top w:type="dxa" w:w="70"/>
+              <w:left w:type="dxa" w:w="110"/>
+              <w:bottom w:type="dxa" w:w="70"/>
+              <w:right w:type="dxa" w:w="110"/>
+            </w:tcMar>
+            <w:vAlign w:val="center"/>
+          </w:tcPr>
+          <w:p>
+            <w:pPr>
+              <w:spacing w:after="40" w:line="270"/>
+            </w:pPr>
+            <w:r>
+              <w:rPr>
+                <w:rFonts w:ascii="맑은 고딕" w:cs="맑은 고딕" w:eastAsia="맑은 고딕" w:hAnsi="맑은 고딕"/>
+                <w:b/>
+                <w:bCs/>
+                <w:sz w:val="18"/>
+                <w:szCs w:val="18"/>
+              </w:rPr>
+              <w:t xml:space="preserve">Lab 5</w:t>
+            </w:r>
+          </w:p>
+        </w:tc>
+        <w:tc>
+          <w:tcPr>
+            <w:tcW w:type="dxa" w:w="4238"/>
+            <w:tcBorders>
+              <w:top w:val="single" w:color="C9D7DA" w:sz="4"/>
+              <w:left w:val="single" w:color="C9D7DA" w:sz="4"/>
+              <w:bottom w:val="single" w:color="C9D7DA" w:sz="4"/>
+              <w:right w:val="single" w:color="C9D7DA" w:sz="4"/>
+            </w:tcBorders>
+            <w:tcMar>
+              <w:top w:type="dxa" w:w="70"/>
+              <w:left w:type="dxa" w:w="110"/>
+              <w:bottom w:type="dxa" w:w="70"/>
+              <w:right w:type="dxa" w:w="110"/>
+            </w:tcMar>
+            <w:vAlign w:val="center"/>
+          </w:tcPr>
+          <w:p>
+            <w:pPr>
+              <w:spacing w:after="40" w:line="270"/>
+            </w:pPr>
+            <w:r>
+              <w:rPr>
+                <w:rFonts w:ascii="맑은 고딕" w:cs="맑은 고딕" w:eastAsia="맑은 고딕" w:hAnsi="맑은 고딕"/>
+                <w:b w:val="false"/>
+                <w:bCs w:val="false"/>
+                <w:sz w:val="18"/>
+                <w:szCs w:val="18"/>
+              </w:rPr>
+              <w:t xml:space="preserve">저장과 정리</w:t>
+            </w:r>
+          </w:p>
+        </w:tc>
+        <w:tc>
+          <w:tcPr>
+            <w:tcW w:type="dxa" w:w="1400"/>
+            <w:tcBorders>
+              <w:top w:val="single" w:color="C9D7DA" w:sz="4"/>
+              <w:left w:val="single" w:color="C9D7DA" w:sz="4"/>
+              <w:bottom w:val="single" w:color="C9D7DA" w:sz="4"/>
+              <w:right w:val="single" w:color="C9D7DA" w:sz="4"/>
+            </w:tcBorders>
+            <w:tcMar>
+              <w:top w:type="dxa" w:w="70"/>
+              <w:left w:type="dxa" w:w="110"/>
+              <w:bottom w:type="dxa" w:w="70"/>
+              <w:right w:type="dxa" w:w="110"/>
+            </w:tcMar>
+            <w:vAlign w:val="center"/>
+          </w:tcPr>
+          <w:p>
+            <w:pPr>
+              <w:spacing w:after="40" w:line="270"/>
+            </w:pPr>
+            <w:r>
+              <w:rPr>
+                <w:rFonts w:ascii="맑은 고딕" w:cs="맑은 고딕" w:eastAsia="맑은 고딕" w:hAnsi="맑은 고딕"/>
+                <w:b w:val="false"/>
+                <w:bCs w:val="false"/>
+                <w:sz w:val="18"/>
+                <w:szCs w:val="18"/>
+              </w:rPr>
               <w:t xml:space="preserve">10분</w:t>
             </w:r>
           </w:p>
@@ -8556,7 +8688,6 @@
               <w:bottom w:val="single" w:color="C9D7DA" w:sz="4"/>
               <w:right w:val="single" w:color="C9D7DA" w:sz="4"/>
             </w:tcBorders>
-            <w:shd w:fill="EAF1F2" w:color="auto" w:val="clear"/>
             <w:tcMar>
               <w:top w:type="dxa" w:w="70"/>
               <w:left w:type="dxa" w:w="110"/>
@@ -9445,7 +9576,7 @@
                 <w:sz w:val="18"/>
                 <w:szCs w:val="18"/>
               </w:rPr>
-              <w:t xml:space="preserve">이렇게 해 보세요</w:t>
+              <w:t xml:space="preserve">해결 방법</w:t>
             </w:r>
           </w:p>
         </w:tc>
@@ -10223,7 +10354,7 @@
                 <w:sz w:val="18"/>
                 <w:szCs w:val="18"/>
               </w:rPr>
-              <w:t xml:space="preserve">이렇게 해 보세요</w:t>
+              <w:t xml:space="preserve">해결 방법</w:t>
             </w:r>
           </w:p>
         </w:tc>
@@ -10512,7 +10643,7 @@
               <w:rPr>
                 <w:rFonts w:ascii="맑은 고딕" w:cs="맑은 고딕" w:eastAsia="맑은 고딕" w:hAnsi="맑은 고딕"/>
               </w:rPr>
-              <w:t xml:space="preserve">작업 상태(TestCaseWorkState)는 IN_WORK로 해줘.</w:t>
+              <w:t xml:space="preserve">작업 상태(TestCaseWorkState)는 IN_WORK로 해줘. 메뉴 작업 말고 속성 변경(set_attribute)으로 바꿔.</w:t>
             </w:r>
           </w:p>
           <w:p>
@@ -11071,7 +11202,7 @@
                 <w:sz w:val="18"/>
                 <w:szCs w:val="18"/>
               </w:rPr>
-              <w:t xml:space="preserve">이렇게 해 보세요</w:t>
+              <w:t xml:space="preserve">해결 방법</w:t>
             </w:r>
           </w:p>
         </w:tc>
@@ -11213,7 +11344,7 @@
                 <w:sz w:val="18"/>
                 <w:szCs w:val="18"/>
               </w:rPr>
-              <w:t xml:space="preserve">대화상자를 닫고 "이름과 설명은 속성 변경(set_attribute)으로 해줘"라고 지시한다. 스킬팩을 설치하면 대부분 예방된다.</w:t>
+              <w:t xml:space="preserve">AI가 작업 상태나 이름을 메뉴 작업으로 바꾸려 한 경우다. 대화상자를 닫고 "작업 상태와 이름은 속성 변경(set_attribute)으로 해줘"라고 지시한다.</w:t>
             </w:r>
           </w:p>
         </w:tc>
@@ -11285,7 +11416,7 @@
         <w:rPr>
           <w:rFonts w:ascii="맑은 고딕" w:cs="맑은 고딕" w:eastAsia="맑은 고딕" w:hAnsi="맑은 고딕"/>
         </w:rPr>
-        <w:t xml:space="preserve">[실습 이메일], [실습 비밀번호]는 강사가 나눠 준 계정으로 바꾼다.</w:t>
+        <w:t xml:space="preserve">[실습 이메일]은 강사가 나눠 준 계정 이메일로 바꾼다.</w:t>
       </w:r>
     </w:p>
     <w:p>
@@ -11301,7 +11432,7 @@
         <w:rPr>
           <w:rFonts w:ascii="맑은 고딕" w:cs="맑은 고딕" w:eastAsia="맑은 고딕" w:hAnsi="맑은 고딕"/>
         </w:rPr>
-        <w:t xml:space="preserve">실무에서는 비밀번호를 평문 값으로 두지 않는다. 오늘은 실습이라 그대로 넣는다.</w:t>
+        <w:t xml:space="preserve">비밀번호는 AI에게 보내지 않는다. 강사가 TestCases/MCP실습 폴더에 DWS_Password라는 TCP로 넣어 두었으므로, 프롬프트에는 참조 {CP[DWS_Password]}만 적는다.</w:t>
       </w:r>
     </w:p>
     <w:p>
@@ -11456,22 +11587,7 @@
               <w:rPr>
                 <w:rFonts w:ascii="맑은 고딕" w:cs="맑은 고딕" w:eastAsia="맑은 고딕" w:hAnsi="맑은 고딕"/>
               </w:rPr>
-              <w:t xml:space="preserve">, Password </w:t>
-            </w:r>
-            <w:r>
-              <w:rPr>
-                <w:rFonts w:ascii="맑은 고딕" w:cs="맑은 고딕" w:eastAsia="맑은 고딕" w:hAnsi="맑은 고딕"/>
-                <w:b/>
-                <w:bCs/>
-                <w:color w:val="C4453C"/>
-              </w:rPr>
-              <w:t xml:space="preserve">[실습 비밀번호]</w:t>
-            </w:r>
-            <w:r>
-              <w:rPr>
-                <w:rFonts w:ascii="맑은 고딕" w:cs="맑은 고딕" w:eastAsia="맑은 고딕" w:hAnsi="맑은 고딕"/>
-              </w:rPr>
-              <w:t xml:space="preserve"> 입력 후 Log in 클릭</w:t>
+              <w:t xml:space="preserve">, Password {CP[DWS_Password]} 입력 후 Log in 클릭</w:t>
             </w:r>
           </w:p>
           <w:p>
@@ -12508,7 +12624,7 @@
                 <w:sz w:val="18"/>
                 <w:szCs w:val="18"/>
               </w:rPr>
-              <w:t xml:space="preserve">[실습 비밀번호]</w:t>
+              <w:t xml:space="preserve">{CP[DWS_Password]}</w:t>
             </w:r>
           </w:p>
         </w:tc>
@@ -13281,6 +13397,25 @@
         <w:rPr>
           <w:rFonts w:ascii="맑은 고딕" w:cs="맑은 고딕" w:eastAsia="맑은 고딕" w:hAnsi="맑은 고딕"/>
         </w:rPr>
+        <w:t xml:space="preserve">  Password 값이 {CP[DWS_Password]} 참조로 들어갔다 (실제 비밀번호가 아님)</w:t>
+      </w:r>
+    </w:p>
+    <w:p>
+      <w:pPr>
+        <w:spacing w:after="70" w:line="290"/>
+        <w:ind w:left="360" w:hanging="360"/>
+      </w:pPr>
+      <w:r>
+        <w:rPr>
+          <w:rFonts w:ascii="맑은 고딕" w:cs="맑은 고딕" w:eastAsia="맑은 고딕" w:hAnsi="맑은 고딕"/>
+          <w:color w:val="0F4C5C"/>
+        </w:rPr>
+        <w:t xml:space="preserve">☐</w:t>
+      </w:r>
+      <w:r>
+        <w:rPr>
+          <w:rFonts w:ascii="맑은 고딕" w:cs="맑은 고딕" w:eastAsia="맑은 고딕" w:hAnsi="맑은 고딕"/>
+        </w:rPr>
         <w:t xml:space="preserve">  결과 표가 계획 표(기대 스텝)와 같다</w:t>
       </w:r>
     </w:p>
@@ -13584,7 +13719,7 @@
                 <w:sz w:val="18"/>
                 <w:szCs w:val="18"/>
               </w:rPr>
-              <w:t xml:space="preserve">이렇게 해 보세요</w:t>
+              <w:t xml:space="preserve">해결 방법</w:t>
             </w:r>
           </w:p>
         </w:tc>
@@ -13727,6 +13862,77 @@
                 <w:szCs w:val="18"/>
               </w:rPr>
               <w:t xml:space="preserve">"3번 스텝의 Email 값만 [실습 이메일]로 고쳐줘"처럼 스텝 번호와 속성을 짚어서 고친다.</w:t>
+            </w:r>
+          </w:p>
+        </w:tc>
+      </w:tr>
+      <w:tr>
+        <w:trPr>
+          <w:cantSplit/>
+        </w:trPr>
+        <w:tc>
+          <w:tcPr>
+            <w:tcW w:type="dxa" w:w="2800"/>
+            <w:tcBorders>
+              <w:top w:val="single" w:color="C9D7DA" w:sz="4"/>
+              <w:left w:val="single" w:color="C9D7DA" w:sz="4"/>
+              <w:bottom w:val="single" w:color="C9D7DA" w:sz="4"/>
+              <w:right w:val="single" w:color="C9D7DA" w:sz="4"/>
+            </w:tcBorders>
+            <w:tcMar>
+              <w:top w:type="dxa" w:w="70"/>
+              <w:left w:type="dxa" w:w="110"/>
+              <w:bottom w:type="dxa" w:w="70"/>
+              <w:right w:type="dxa" w:w="110"/>
+            </w:tcMar>
+            <w:vAlign w:val="center"/>
+          </w:tcPr>
+          <w:p>
+            <w:pPr>
+              <w:spacing w:after="40" w:line="270"/>
+            </w:pPr>
+            <w:r>
+              <w:rPr>
+                <w:rFonts w:ascii="맑은 고딕" w:cs="맑은 고딕" w:eastAsia="맑은 고딕" w:hAnsi="맑은 고딕"/>
+                <w:b/>
+                <w:bCs/>
+                <w:sz w:val="18"/>
+                <w:szCs w:val="18"/>
+              </w:rPr>
+              <w:t xml:space="preserve">두세 번 고쳐도 계속 틀림</w:t>
+            </w:r>
+          </w:p>
+        </w:tc>
+        <w:tc>
+          <w:tcPr>
+            <w:tcW w:type="dxa" w:w="6838"/>
+            <w:tcBorders>
+              <w:top w:val="single" w:color="C9D7DA" w:sz="4"/>
+              <w:left w:val="single" w:color="C9D7DA" w:sz="4"/>
+              <w:bottom w:val="single" w:color="C9D7DA" w:sz="4"/>
+              <w:right w:val="single" w:color="C9D7DA" w:sz="4"/>
+            </w:tcBorders>
+            <w:tcMar>
+              <w:top w:type="dxa" w:w="70"/>
+              <w:left w:type="dxa" w:w="110"/>
+              <w:bottom w:type="dxa" w:w="70"/>
+              <w:right w:type="dxa" w:w="110"/>
+            </w:tcMar>
+            <w:vAlign w:val="center"/>
+          </w:tcPr>
+          <w:p>
+            <w:pPr>
+              <w:spacing w:after="40" w:line="270"/>
+            </w:pPr>
+            <w:r>
+              <w:rPr>
+                <w:rFonts w:ascii="맑은 고딕" w:cs="맑은 고딕" w:eastAsia="맑은 고딕" w:hAnsi="맑은 고딕"/>
+                <w:b w:val="false"/>
+                <w:bCs w:val="false"/>
+                <w:sz w:val="18"/>
+                <w:szCs w:val="18"/>
+              </w:rPr>
+              <w:t xml:space="preserve">강사가 준비한 완성본 TestCases/MCP실습/_완성본/로그인 성공_자동을 내 폴더로 복사해 Lab 4를 진행한다.</w:t>
             </w:r>
           </w:p>
         </w:tc>
@@ -13847,6 +14053,22 @@
     </w:p>
     <w:p>
       <w:pPr>
+        <w:pStyle w:val="ListParagraph"/>
+        <w:numPr>
+          <w:ilvl w:val="0"/>
+          <w:numId w:val="6"/>
+        </w:numPr>
+        <w:spacing w:after="80" w:line="290"/>
+      </w:pPr>
+      <w:r>
+        <w:rPr>
+          <w:rFonts w:ascii="맑은 고딕" w:cs="맑은 고딕" w:eastAsia="맑은 고딕" w:hAnsi="맑은 고딕"/>
+        </w:rPr>
+        <w:t xml:space="preserve">실행은 저장된 상태로 돈다. 값을 바꾼 뒤 저장하지 않으면 바뀐 값이 실행에 들어가지 않는다.</w:t>
+      </w:r>
+    </w:p>
+    <w:p>
+      <w:pPr>
         <w:keepNext w:val="false"/>
         <w:spacing w:after="60"/>
       </w:pPr>
@@ -13912,7 +14134,7 @@
               <w:rPr>
                 <w:rFonts w:ascii="맑은 고딕" w:cs="맑은 고딕" w:eastAsia="맑은 고딕" w:hAnsi="맑은 고딕"/>
               </w:rPr>
-              <w:t xml:space="preserve">'로그인 성공_자동' 테스트케이스를 ScratchBook에서 검증 실행해줘. 끝나면 스텝별 통과/실패를 표로 보여줘.</w:t>
+              <w:t xml:space="preserve">워크스페이스를 저장한 다음 '로그인 성공_자동' 테스트케이스를 ScratchBook에서 검증 실행해줘. 끝나면 스텝별 통과/실패를 표로 보여줘.</w:t>
             </w:r>
           </w:p>
         </w:tc>
@@ -13985,7 +14207,7 @@
               <w:rPr>
                 <w:rFonts w:ascii="맑은 고딕" w:cs="맑은 고딕" w:eastAsia="맑은 고딕" w:hAnsi="맑은 고딕"/>
               </w:rPr>
-              <w:t xml:space="preserve">같은 테스트케이스에서 Account의 Verify 값을 wrong@example.com 으로 바꾸고 다시 검증 실행해줘.</w:t>
+              <w:t xml:space="preserve">같은 테스트케이스에서 Account의 Verify 값을 wrong@example.com 으로 바꾸고, 저장한 다음 다시 검증 실행해줘.</w:t>
             </w:r>
           </w:p>
         </w:tc>
@@ -14146,7 +14368,7 @@
               <w:rPr>
                 <w:rFonts w:ascii="맑은 고딕" w:cs="맑은 고딕" w:eastAsia="맑은 고딕" w:hAnsi="맑은 고딕"/>
               </w:rPr>
-              <w:t xml:space="preserve">로 되돌리고 다시 검증 실행해줘. 통과하면 결과 표를 보여줘.</w:t>
+              <w:t xml:space="preserve">로 되돌리고, 저장한 다음 다시 검증 실행해줘. 통과하면 결과 표를 보여줘.</w:t>
             </w:r>
           </w:p>
         </w:tc>
@@ -14246,7 +14468,7 @@
           <w:sz w:val="19"/>
           <w:szCs w:val="19"/>
         </w:rPr>
-        <w:t xml:space="preserve">왜 일부러 실패를 만드나요</w:t>
+        <w:t xml:space="preserve">일부러 실패를 만드는 이유</w:t>
       </w:r>
     </w:p>
     <w:p>
@@ -14705,7 +14927,7 @@
                 <w:sz w:val="18"/>
                 <w:szCs w:val="18"/>
               </w:rPr>
-              <w:t xml:space="preserve">이렇게 해 보세요</w:t>
+              <w:t xml:space="preserve">해결 방법</w:t>
             </w:r>
           </w:p>
         </w:tc>
@@ -14977,7 +15199,44 @@
     </w:p>
     <w:p>
       <w:pPr>
-        <w:spacing w:after="120" w:before="0" w:line="300"/>
+        <w:pStyle w:val="ListParagraph"/>
+        <w:numPr>
+          <w:ilvl w:val="0"/>
+          <w:numId w:val="7"/>
+        </w:numPr>
+        <w:spacing w:after="80" w:line="290"/>
+      </w:pPr>
+      <w:r>
+        <w:rPr>
+          <w:rFonts w:ascii="맑은 고딕" w:cs="맑은 고딕" w:eastAsia="맑은 고딕" w:hAnsi="맑은 고딕"/>
+        </w:rPr>
+        <w:t xml:space="preserve">Lab 2, Lab 3에서 만든 테스트케이스는 만들 때 이미 저장됐다. 저장이 필요한 것은 Lab 4처럼 값을 바꾼 경우다.</w:t>
+      </w:r>
+    </w:p>
+    <w:p>
+      <w:pPr>
+        <w:pStyle w:val="ListParagraph"/>
+        <w:numPr>
+          <w:ilvl w:val="0"/>
+          <w:numId w:val="7"/>
+        </w:numPr>
+        <w:spacing w:after="80" w:line="290"/>
+      </w:pPr>
+      <w:r>
+        <w:rPr>
+          <w:rFonts w:ascii="맑은 고딕" w:cs="맑은 고딕" w:eastAsia="맑은 고딕" w:hAnsi="맑은 고딕"/>
+        </w:rPr>
+        <w:t xml:space="preserve">AI가 오늘 바꾼 것을 기억하려면 Lab 0부터 같은 대화창을 써야 한다. 새 대화를 열었다면 경로를 직접 알려 준다.</w:t>
+      </w:r>
+    </w:p>
+    <w:p>
+      <w:pPr>
+        <w:pStyle w:val="ListParagraph"/>
+        <w:numPr>
+          <w:ilvl w:val="0"/>
+          <w:numId w:val="7"/>
+        </w:numPr>
+        <w:spacing w:after="80" w:line="290"/>
       </w:pPr>
       <w:r>
         <w:rPr>
@@ -15126,7 +15385,7 @@
               <w:rPr>
                 <w:rFonts w:ascii="맑은 고딕" w:cs="맑은 고딕" w:eastAsia="맑은 고딕" w:hAnsi="맑은 고딕"/>
               </w:rPr>
-              <w:t xml:space="preserve">(멀티 유저일 때) 바뀐 객체 목록을 먼저 보여줘. 내가 확인하면 저장하고 체크인해줘. 체크인 코멘트는 'MCP 실습: 로그인 테스트 추가'로 남겨줘.</w:t>
+              <w:t xml:space="preserve">(멀티 유저일 때) 이번 대화에서 체크아웃하거나 바꾼 객체 목록을 먼저 보여줘. 체크인은 내가 체크아웃한 객체 전부에 적용되니까, 내가 목록을 확인하면 저장하고 체크인해줘. 체크인 코멘트는 'MCP 실습: 로그인 테스트 추가'로 남겨줘.</w:t>
             </w:r>
           </w:p>
         </w:tc>
@@ -15552,7 +15811,7 @@
                 <w:sz w:val="18"/>
                 <w:szCs w:val="18"/>
               </w:rPr>
-              <w:t xml:space="preserve">이렇게 해 보세요</w:t>
+              <w:t xml:space="preserve">해결 방법</w:t>
             </w:r>
           </w:p>
         </w:tc>
@@ -15649,7 +15908,7 @@
         <w:rPr>
           <w:rFonts w:ascii="맑은 고딕" w:cs="맑은 고딕" w:eastAsia="맑은 고딕" w:hAnsi="맑은 고딕"/>
         </w:rPr>
-        <w:t xml:space="preserve">4.1  현업에서 많이 쓰는 여섯 가지</w:t>
+        <w:t xml:space="preserve">4.1  업무에 써 볼 만한 여섯 가지</w:t>
       </w:r>
     </w:p>
     <w:tbl>
@@ -16823,6 +17082,146 @@
                 <w:szCs w:val="18"/>
               </w:rPr>
               <w:t xml:space="preserve">T17</w:t>
+            </w:r>
+          </w:p>
+        </w:tc>
+      </w:tr>
+    </w:tbl>
+    <w:p>
+      <w:pPr>
+        <w:keepNext w:val="false"/>
+        <w:spacing w:after="120"/>
+      </w:pPr>
+    </w:p>
+    <w:p>
+      <w:pPr>
+        <w:spacing w:after="120" w:before="0" w:line="300"/>
+      </w:pPr>
+      <w:r>
+        <w:rPr>
+          <w:rFonts w:ascii="맑은 고딕" w:cs="맑은 고딕" w:eastAsia="맑은 고딕" w:hAnsi="맑은 고딕"/>
+        </w:rPr>
+        <w:t xml:space="preserve">6번 중 API 모듈 만들기는 대응하는 공식 워크플로가 없어 템플릿이 없습니다. 4.3의 네 요소로 직접 씁니다. 예를 들면 다음과 같습니다.</w:t>
+      </w:r>
+    </w:p>
+    <w:tbl>
+      <w:tblPr>
+        <w:tblW w:type="dxa" w:w="9638"/>
+        <w:tblBorders>
+          <w:top w:val="single" w:color="auto" w:sz="4"/>
+          <w:left w:val="single" w:color="auto" w:sz="4"/>
+          <w:bottom w:val="single" w:color="auto" w:sz="4"/>
+          <w:right w:val="single" w:color="auto" w:sz="4"/>
+          <w:insideH w:val="single" w:color="auto" w:sz="4"/>
+          <w:insideV w:val="single" w:color="auto" w:sz="4"/>
+        </w:tblBorders>
+        <w:tblLayout w:type="fixed"/>
+      </w:tblPr>
+      <w:tblGrid>
+        <w:gridCol w:w="9638"/>
+      </w:tblGrid>
+      <w:tr>
+        <w:trPr>
+          <w:cantSplit/>
+        </w:trPr>
+        <w:tc>
+          <w:tcPr>
+            <w:tcW w:type="dxa" w:w="9638"/>
+            <w:tcBorders>
+              <w:top w:val="single" w:color="E0A03A" w:sz="6"/>
+              <w:left w:val="single" w:color="E0A03A" w:sz="6"/>
+              <w:bottom w:val="single" w:color="E0A03A" w:sz="6"/>
+              <w:right w:val="single" w:color="E0A03A" w:sz="6"/>
+            </w:tcBorders>
+            <w:shd w:fill="FCF1DC" w:color="auto" w:val="clear"/>
+            <w:tcMar>
+              <w:top w:type="dxa" w:w="120"/>
+              <w:left w:type="dxa" w:w="200"/>
+              <w:bottom w:type="dxa" w:w="120"/>
+              <w:right w:type="dxa" w:w="200"/>
+            </w:tcMar>
+          </w:tcPr>
+          <w:p>
+            <w:pPr>
+              <w:spacing w:after="60"/>
+            </w:pPr>
+            <w:r>
+              <w:rPr>
+                <w:rFonts w:ascii="맑은 고딕" w:cs="맑은 고딕" w:eastAsia="맑은 고딕" w:hAnsi="맑은 고딕"/>
+                <w:b/>
+                <w:bCs/>
+                <w:color w:val="8A5A0B"/>
+                <w:sz w:val="17"/>
+                <w:szCs w:val="17"/>
+              </w:rPr>
+              <w:t xml:space="preserve">API 모듈 프롬프트 예</w:t>
+            </w:r>
+          </w:p>
+          <w:p>
+            <w:pPr>
+              <w:spacing w:after="30" w:line="290"/>
+            </w:pPr>
+            <w:r>
+              <w:rPr>
+                <w:rFonts w:ascii="맑은 고딕" w:cs="맑은 고딕" w:eastAsia="맑은 고딕" w:hAnsi="맑은 고딕"/>
+              </w:rPr>
+              <w:t xml:space="preserve">API 연결 목록을 먼저 보여줘. 그다음 </w:t>
+            </w:r>
+            <w:r>
+              <w:rPr>
+                <w:rFonts w:ascii="맑은 고딕" w:cs="맑은 고딕" w:eastAsia="맑은 고딕" w:hAnsi="맑은 고딕"/>
+                <w:b/>
+                <w:bCs/>
+                <w:color w:val="C4453C"/>
+              </w:rPr>
+              <w:t xml:space="preserve">[연결 이름]</w:t>
+            </w:r>
+            <w:r>
+              <w:rPr>
+                <w:rFonts w:ascii="맑은 고딕" w:cs="맑은 고딕" w:eastAsia="맑은 고딕" w:hAnsi="맑은 고딕"/>
+              </w:rPr>
+              <w:t xml:space="preserve">으로 </w:t>
+            </w:r>
+            <w:r>
+              <w:rPr>
+                <w:rFonts w:ascii="맑은 고딕" w:cs="맑은 고딕" w:eastAsia="맑은 고딕" w:hAnsi="맑은 고딕"/>
+                <w:b/>
+                <w:bCs/>
+                <w:color w:val="C4453C"/>
+              </w:rPr>
+              <w:t xml:space="preserve">[엔드포인트 경로]</w:t>
+            </w:r>
+            <w:r>
+              <w:rPr>
+                <w:rFonts w:ascii="맑은 고딕" w:cs="맑은 고딕" w:eastAsia="맑은 고딕" w:hAnsi="맑은 고딕"/>
+              </w:rPr>
+              <w:t xml:space="preserve">에 GET 요청을 보내는 API 모듈을 </w:t>
+            </w:r>
+            <w:r>
+              <w:rPr>
+                <w:rFonts w:ascii="맑은 고딕" w:cs="맑은 고딕" w:eastAsia="맑은 고딕" w:hAnsi="맑은 고딕"/>
+                <w:b/>
+                <w:bCs/>
+                <w:color w:val="C4453C"/>
+              </w:rPr>
+              <w:t xml:space="preserve">[모듈 폴더 경로]</w:t>
+            </w:r>
+            <w:r>
+              <w:rPr>
+                <w:rFonts w:ascii="맑은 고딕" w:cs="맑은 고딕" w:eastAsia="맑은 고딕" w:hAnsi="맑은 고딕"/>
+              </w:rPr>
+              <w:t xml:space="preserve">에 만들 계획을 보여줘.</w:t>
+            </w:r>
+          </w:p>
+          <w:p>
+            <w:pPr>
+              <w:spacing w:after="30" w:line="290"/>
+            </w:pPr>
+            <w:r>
+              <w:rPr>
+                <w:rFonts w:ascii="맑은 고딕" w:cs="맑은 고딕" w:eastAsia="맑은 고딕" w:hAnsi="맑은 고딕"/>
+              </w:rPr>
+              <w:t xml:space="preserve">만들고 나면 실제 응답 상태 코드와 응답 본문 일부를 알려줘. 인증 정보는 내가 직접 넣을 테니 묻지 마.</w:t>
             </w:r>
           </w:p>
         </w:tc>
@@ -18277,7 +18676,7 @@
         <w:rPr>
           <w:rFonts w:ascii="맑은 고딕" w:cs="맑은 고딕" w:eastAsia="맑은 고딕" w:hAnsi="맑은 고딕"/>
         </w:rPr>
-        <w:t xml:space="preserve">4.4  결과를 바꾸는 습관 일곱 가지</w:t>
+        <w:t xml:space="preserve">4.4  프롬프트 작성 요령 일곱 가지</w:t>
       </w:r>
     </w:p>
     <w:p>
@@ -18285,7 +18684,7 @@
         <w:pStyle w:val="ListParagraph"/>
         <w:numPr>
           <w:ilvl w:val="0"/>
-          <w:numId w:val="7"/>
+          <w:numId w:val="8"/>
         </w:numPr>
         <w:spacing w:after="80" w:line="290"/>
       </w:pPr>
@@ -18309,7 +18708,7 @@
         <w:pStyle w:val="ListParagraph"/>
         <w:numPr>
           <w:ilvl w:val="0"/>
-          <w:numId w:val="7"/>
+          <w:numId w:val="8"/>
         </w:numPr>
         <w:spacing w:after="80" w:line="290"/>
       </w:pPr>
@@ -18333,7 +18732,7 @@
         <w:pStyle w:val="ListParagraph"/>
         <w:numPr>
           <w:ilvl w:val="0"/>
-          <w:numId w:val="7"/>
+          <w:numId w:val="8"/>
         </w:numPr>
         <w:spacing w:after="80" w:line="290"/>
       </w:pPr>
@@ -18357,7 +18756,7 @@
         <w:pStyle w:val="ListParagraph"/>
         <w:numPr>
           <w:ilvl w:val="0"/>
-          <w:numId w:val="7"/>
+          <w:numId w:val="8"/>
         </w:numPr>
         <w:spacing w:after="80" w:line="290"/>
       </w:pPr>
@@ -18381,7 +18780,7 @@
         <w:pStyle w:val="ListParagraph"/>
         <w:numPr>
           <w:ilvl w:val="0"/>
-          <w:numId w:val="7"/>
+          <w:numId w:val="8"/>
         </w:numPr>
         <w:spacing w:after="80" w:line="290"/>
       </w:pPr>
@@ -18405,7 +18804,7 @@
         <w:pStyle w:val="ListParagraph"/>
         <w:numPr>
           <w:ilvl w:val="0"/>
-          <w:numId w:val="7"/>
+          <w:numId w:val="8"/>
         </w:numPr>
         <w:spacing w:after="80" w:line="290"/>
       </w:pPr>
@@ -18429,7 +18828,7 @@
         <w:pStyle w:val="ListParagraph"/>
         <w:numPr>
           <w:ilvl w:val="0"/>
-          <w:numId w:val="7"/>
+          <w:numId w:val="8"/>
         </w:numPr>
         <w:spacing w:after="80" w:line="290"/>
       </w:pPr>
@@ -18458,13 +18857,13 @@
           <w:b/>
           <w:bCs/>
         </w:rPr>
-        <w:t xml:space="preserve">하나만 고른다면 3번입니다. </w:t>
+        <w:t xml:space="preserve">가장 중요한 것은 3번입니다. </w:t>
       </w:r>
       <w:r>
         <w:rPr>
           <w:rFonts w:ascii="맑은 고딕" w:cs="맑은 고딕" w:eastAsia="맑은 고딕" w:hAnsi="맑은 고딕"/>
         </w:rPr>
-        <w:t xml:space="preserve">계획을 먼저 보면 AI가 무엇을 오해했는지 실행 전에 알 수 있습니다. 이 습관들은 5장 T00 공통 머리말에 규칙으로 들어 있습니다.</w:t>
+        <w:t xml:space="preserve">계획을 먼저 보면 AI가 무엇을 오해했는지 실행 전에 알 수 있습니다. 이 요령들은 5장 T00 공통 머리말에 규칙으로 들어 있습니다.</w:t>
       </w:r>
     </w:p>
     <w:p>
@@ -19187,7 +19586,7 @@
         <w:rPr>
           <w:rFonts w:ascii="맑은 고딕" w:cs="맑은 고딕" w:eastAsia="맑은 고딕" w:hAnsi="맑은 고딕"/>
         </w:rPr>
-        <w:t xml:space="preserve">Tricentis가 공개한 commander-mcp 스킬팩 1.2.1에는 AI가 따라 하는 워크플로 템플릿 18종이 들어 있습니다. 이 장의 T01~T18은 그 18종에 하나씩 대응하는 사람용 프롬프트 템플릿입니다. 번호 순서도 공식 워크플로 목록(reference/workflows-index.md)과 같습니다.</w:t>
+        <w:t xml:space="preserve">Tricentis가 공개한 commander-mcp 스킬팩 1.2.1에는 AI가 따라 하는 워크플로 템플릿 18종이 들어 있습니다. 이것은 AI용입니다. 이 장의 T00~T18은 이 과정에서 그 18종에 하나씩 맞춰 만든 사람용 프롬프트 템플릿입니다. 번호는 대응 관계를 찾기 쉽게 공식 워크플로 목록(reference/workflows-index.md) 순서를 따랐습니다.</w:t>
       </w:r>
     </w:p>
     <w:p>
@@ -19198,7 +19597,7 @@
         <w:rPr>
           <w:rFonts w:ascii="맑은 고딕" w:cs="맑은 고딕" w:eastAsia="맑은 고딕" w:hAnsi="맑은 고딕"/>
         </w:rPr>
-        <w:t xml:space="preserve">스킬팩을 설치하면 AI가 공식 워크플로 순서를 스스로 따릅니다. 템플릿은 그 워크플로에 필요한 정보(경로, 범위, 값, 확인 방식)를 빠짐없이 넘겨주는 역할을 합니다.</w:t>
+        <w:t xml:space="preserve">스킬팩이 설치돼 있으면 AI는 요청 내용에 맞는 공식 워크플로를 골라 순서대로 따릅니다. 템플릿은 그 워크플로에 필요한 정보(경로, 범위, 값, 확인 방식)를 빠짐없이 넘겨주는 역할을 합니다. 사내에서 만든 템플릿이 있다면 같은 형식(언제 쓰나, 본문, 예시, 도구, 확인할 점)으로 이 장에 추가합니다.</w:t>
       </w:r>
     </w:p>
     <w:p>
@@ -19217,7 +19616,7 @@
         <w:pStyle w:val="ListParagraph"/>
         <w:numPr>
           <w:ilvl w:val="0"/>
-          <w:numId w:val="8"/>
+          <w:numId w:val="9"/>
         </w:numPr>
         <w:spacing w:after="80" w:line="290"/>
       </w:pPr>
@@ -19233,7 +19632,7 @@
         <w:pStyle w:val="ListParagraph"/>
         <w:numPr>
           <w:ilvl w:val="0"/>
-          <w:numId w:val="8"/>
+          <w:numId w:val="9"/>
         </w:numPr>
         <w:spacing w:after="80" w:line="290"/>
       </w:pPr>
@@ -19249,7 +19648,7 @@
         <w:pStyle w:val="ListParagraph"/>
         <w:numPr>
           <w:ilvl w:val="0"/>
-          <w:numId w:val="8"/>
+          <w:numId w:val="9"/>
         </w:numPr>
         <w:spacing w:after="80" w:line="290"/>
       </w:pPr>
@@ -19265,7 +19664,7 @@
         <w:pStyle w:val="ListParagraph"/>
         <w:numPr>
           <w:ilvl w:val="0"/>
-          <w:numId w:val="8"/>
+          <w:numId w:val="9"/>
         </w:numPr>
         <w:spacing w:after="80" w:line="290"/>
       </w:pPr>
@@ -19281,7 +19680,7 @@
         <w:pStyle w:val="ListParagraph"/>
         <w:numPr>
           <w:ilvl w:val="0"/>
-          <w:numId w:val="8"/>
+          <w:numId w:val="9"/>
         </w:numPr>
         <w:spacing w:after="80" w:line="290"/>
       </w:pPr>
@@ -19297,7 +19696,7 @@
         <w:pStyle w:val="ListParagraph"/>
         <w:numPr>
           <w:ilvl w:val="0"/>
-          <w:numId w:val="8"/>
+          <w:numId w:val="9"/>
         </w:numPr>
         <w:spacing w:after="80" w:line="290"/>
       </w:pPr>
@@ -22270,7 +22669,7 @@
               <w:rPr>
                 <w:rFonts w:ascii="맑은 고딕" w:cs="맑은 고딕" w:eastAsia="맑은 고딕" w:hAnsi="맑은 고딕"/>
               </w:rPr>
-              <w:t xml:space="preserve">5. 이름이나 설명을 바꿀 때는 메뉴 작업 말고 속성 변경(set_attribute)으로 해.</w:t>
+              <w:t xml:space="preserve">5. 이름, 설명, 작업 상태(TestCaseWorkState)는 메뉴 작업 말고 속성 변경(set_attribute)으로 바꿔.</w:t>
             </w:r>
           </w:p>
           <w:p>
@@ -25099,6 +25498,12 @@
                 <w:color w:val="C4453C"/>
               </w:rPr>
               <w:t xml:space="preserve">[PLANNED / IN_WORK / COMPLETED]</w:t>
+            </w:r>
+            <w:r>
+              <w:rPr>
+                <w:rFonts w:ascii="맑은 고딕" w:cs="맑은 고딕" w:eastAsia="맑은 고딕" w:hAnsi="맑은 고딕"/>
+              </w:rPr>
+              <w:t xml:space="preserve">, 속성 변경(set_attribute)으로</w:t>
             </w:r>
           </w:p>
           <w:p>
@@ -25463,7 +25868,7 @@
                 <w:sz w:val="18"/>
                 <w:szCs w:val="18"/>
               </w:rPr>
-              <w:t xml:space="preserve">모듈이 없는 스텝은 사람이 XScan으로 스캔해야 한다. 버퍼 값은 소비하는 쪽에서 {B[이름]}으로 참조된다.</w:t>
+              <w:t xml:space="preserve">모듈이 없는 스텝은 사람이 XScan으로 스캔해야 한다. 비밀번호 같은 값은 프롬프트에 쓰지 말고 TCP 참조 {CP[이름]}로 넣는다. 버퍼 값은 소비하는 쪽에서 {B[이름]}으로 참조된다.</w:t>
             </w:r>
           </w:p>
         </w:tc>
@@ -26549,7 +26954,7 @@
                 <w:sz w:val="18"/>
                 <w:szCs w:val="18"/>
               </w:rPr>
-              <w:t xml:space="preserve">실행은 한 번에 하나. 같은 ExecutionList를 다시 돌리면 이전 결과가 덮이므로, 비교가 필요하면 먼저 보관(Archive actual ExecutionLog)을 요청한다. Patch 버전에 따라 ExecutionList 실행은 지원되지 않을 수 있다.</w:t>
+              <w:t xml:space="preserve">실행은 한 번에 하나. 같은 ExecutionList를 다시 돌리면 이전 결과가 덮이므로, 비교가 필요하면 먼저 보관(Archive actual ExecutionLog)을 요청한다. Tosca 2026.1 문서는 검증 실행을 테스트케이스 단위로 설명하므로, 패치 버전에 따라 ExecutionList 실행은 안 될 수 있다.</w:t>
             </w:r>
           </w:p>
         </w:tc>
@@ -30532,7 +30937,7 @@
                 <w:sz w:val="18"/>
                 <w:szCs w:val="18"/>
               </w:rPr>
-              <w:t xml:space="preserve">체크인은 멀티 유저에서만 된다. 오래 편집할 때는 시작 전에 update_all로 최신 내용을 받아 두면 충돌이 줄어든다.</w:t>
+              <w:t xml:space="preserve">체크인은 멀티 유저에서만 되고, 내가 체크아웃한 객체를 전부 체크인한다. create_test_cases로 만든 테스트케이스는 만들 때 이미 저장·체크인된다. 오래 편집할 때는 시작 전에 update_all로 최신 내용을 받아 두면 충돌이 줄어든다.</w:t>
             </w:r>
           </w:p>
         </w:tc>
@@ -30607,7 +31012,7 @@
               <w:rPr>
                 <w:rFonts w:ascii="맑은 고딕" w:cs="맑은 고딕" w:eastAsia="맑은 고딕" w:hAnsi="맑은 고딕"/>
               </w:rPr>
-              <w:t xml:space="preserve">이번 작업에서 바뀐 객체 목록을 경로와 함께 보여주고 저장해줘. (멀티 유저라면) 내가 목록을 확인한 뒤 체크인까지 해줘. 체크인 코멘트는 '</w:t>
+              <w:t xml:space="preserve">이번 대화에서 바꾸거나 체크아웃한 객체 목록을 경로와 함께 보여주고 저장해줘. (멀티 유저라면) 체크인은 체크아웃한 객체 전부에 적용되니, 내가 목록을 확인한 뒤 체크인해줘. 체크인 코멘트는 '</w:t>
             </w:r>
             <w:r>
               <w:rPr>
@@ -34945,7 +35350,7 @@
                 <w:sz w:val="18"/>
                 <w:szCs w:val="18"/>
               </w:rPr>
-              <w:t xml:space="preserve">대상 또는 상위 폴더가 체크아웃되지 않음 (멀티 유저)</w:t>
+              <w:t xml:space="preserve">작업 이름이 현재 메뉴 목록에 없음. 이름이 다르거나, 멀티 유저에서 체크아웃 전</w:t>
             </w:r>
           </w:p>
         </w:tc>
@@ -34978,7 +35383,7 @@
                 <w:sz w:val="18"/>
                 <w:szCs w:val="18"/>
               </w:rPr>
-              <w:t xml:space="preserve">"상위 폴더를 Checkout 한 다음 다시 시도해줘"</w:t>
+              <w:t xml:space="preserve">"작업 목록을 다시 보고 정확한 이름으로 실행해줘". 멀티 유저라면 대상을 먼저 Checkout (자식 생성·삭제는 상위 폴더)</w:t>
             </w:r>
           </w:p>
         </w:tc>
@@ -35156,7 +35561,7 @@
                 <w:sz w:val="18"/>
                 <w:szCs w:val="18"/>
               </w:rPr>
-              <w:t xml:space="preserve">이름·설명 변경을 메뉴 작업으로 실행함</w:t>
+              <w:t xml:space="preserve">이름·설명·작업 상태 변경을 메뉴 작업으로 실행함</w:t>
             </w:r>
           </w:p>
         </w:tc>
@@ -35439,7 +35844,7 @@
                 <w:sz w:val="18"/>
                 <w:szCs w:val="18"/>
               </w:rPr>
-              <w:t xml:space="preserve">바꾼 내용이 사라짐</w:t>
+              <w:t xml:space="preserve">바꾼 내용이 사라짐, 실행에 안 들어감</w:t>
             </w:r>
           </w:p>
         </w:tc>
@@ -35473,7 +35878,7 @@
                 <w:sz w:val="18"/>
                 <w:szCs w:val="18"/>
               </w:rPr>
-              <w:t xml:space="preserve">저장하지 않고 Commander를 닫음</w:t>
+              <w:t xml:space="preserve">값을 바꾼 뒤 저장하지 않음 (실행도 저장된 상태로 돈다)</w:t>
             </w:r>
           </w:p>
         </w:tc>
@@ -35507,7 +35912,7 @@
                 <w:sz w:val="18"/>
                 <w:szCs w:val="18"/>
               </w:rPr>
-              <w:t xml:space="preserve">작업 끝에 항상 저장 요청 (save_workspace)</w:t>
+              <w:t xml:space="preserve">값을 바꾸면 실행 전과 작업 끝에 저장 요청 (save_workspace)</w:t>
             </w:r>
           </w:p>
         </w:tc>
@@ -35784,7 +36189,7 @@
                 <w:sz w:val="18"/>
                 <w:szCs w:val="18"/>
               </w:rPr>
-              <w:t xml:space="preserve">XScan. AI는 기존 모듈만 재사용하므로 새 화면은 사람이 XScan으로 스캔합니다.</w:t>
+              <w:t xml:space="preserve">XScan. AI는 화면을 스캔해 UI 모듈을 만들 수 없으므로 새 화면은 사람이 XScan으로 스캔합니다.</w:t>
             </w:r>
           </w:p>
         </w:tc>
@@ -37142,6 +37547,12 @@
       <w:startOverride w:val="1"/>
     </w:lvlOverride>
   </w:num>
+  <w:num w:numId="9">
+    <w:abstractNumId w:val="3"/>
+    <w:lvlOverride w:ilvl="0">
+      <w:startOverride w:val="1"/>
+    </w:lvlOverride>
+  </w:num>
 </w:numbering>
 </file>
 

</xml_diff>